<commit_message>
docs: record RentCottage MVP approval
</commit_message>
<xml_diff>
--- a/docs/commercial/Muntajaa-Cost-Plan.docx
+++ b/docs/commercial/Muntajaa-Cost-Plan.docx
@@ -2815,7 +2815,23 @@
                 <w:color w:val="273137"/>
                 <w:sz w:val="18"/>
               </w:rPr>
-              <w:t>A replaceable translation service for owner content, messages and reviews</w:t>
+              <w:t xml:space="preserve">OpenAI </w:t>
+            </w:r>
+            <w:r>
+              <w:rPr>
+                <w:rFonts w:ascii="Courier New" w:hAnsi="Courier New"/>
+                <w:color w:val="273137"/>
+                <w:sz w:val="17"/>
+              </w:rPr>
+              <w:t>gpt-5.6-luna</w:t>
+            </w:r>
+            <w:r>
+              <w:rPr>
+                <w:rFonts w:ascii="Arial" w:hAnsi="Arial"/>
+                <w:color w:val="273137"/>
+                <w:sz w:val="18"/>
+              </w:rPr>
+              <w:t xml:space="preserve"> as the default behind a replaceable AI service, with stronger-model or human escalation</w:t>
             </w:r>
           </w:p>
         </w:tc>
@@ -3308,7 +3324,23 @@
                 <w:color w:val="273137"/>
                 <w:sz w:val="18"/>
               </w:rPr>
-              <w:t>Set per-request and monthly limits after supplier selection</w:t>
+              <w:t xml:space="preserve">Measure </w:t>
+            </w:r>
+            <w:r>
+              <w:rPr>
+                <w:rFonts w:ascii="Courier New" w:hAnsi="Courier New"/>
+                <w:color w:val="273137"/>
+                <w:sz w:val="17"/>
+              </w:rPr>
+              <w:t>gpt-5.6-luna</w:t>
+            </w:r>
+            <w:r>
+              <w:rPr>
+                <w:rFonts w:ascii="Arial" w:hAnsi="Arial"/>
+                <w:color w:val="273137"/>
+                <w:sz w:val="18"/>
+              </w:rPr>
+              <w:t xml:space="preserve"> usage, cache repeat translations, and set per-request and monthly limits before launch</w:t>
             </w:r>
           </w:p>
         </w:tc>
@@ -5265,7 +5297,7 @@
                 <w:color w:val="273137"/>
                 <w:sz w:val="18"/>
               </w:rPr>
-              <w:t>Supplier quality, languages, usage and price must be validated</w:t>
+              <w:t>Arabic and Sorani quality, actual model usage and price must be validated</w:t>
             </w:r>
           </w:p>
         </w:tc>
@@ -6317,7 +6349,39 @@
           <w:color w:val="273137"/>
           <w:sz w:val="19"/>
         </w:rPr>
-        <w:t>6. Select and cost an automatic translation service after quality testing in Arabic and Sorani.</w:t>
+        <w:t xml:space="preserve">6. Quality-test </w:t>
+      </w:r>
+      <w:r>
+        <w:rPr>
+          <w:rFonts w:ascii="Courier New" w:hAnsi="Courier New"/>
+          <w:color w:val="273137"/>
+          <w:sz w:val="18"/>
+        </w:rPr>
+        <w:t>gpt-5.6-luna</w:t>
+      </w:r>
+      <w:r>
+        <w:rPr>
+          <w:rFonts w:ascii="Arial" w:hAnsi="Arial"/>
+          <w:color w:val="273137"/>
+          <w:sz w:val="19"/>
+        </w:rPr>
+        <w:t xml:space="preserve"> with Arabic and Sorani reviewers, validate the </w:t>
+      </w:r>
+      <w:r>
+        <w:rPr>
+          <w:rFonts w:ascii="Courier New" w:hAnsi="Courier New"/>
+          <w:color w:val="273137"/>
+          <w:sz w:val="18"/>
+        </w:rPr>
+        <w:t>gpt-5.6-terra</w:t>
+      </w:r>
+      <w:r>
+        <w:rPr>
+          <w:rFonts w:ascii="Arial" w:hAnsi="Arial"/>
+          <w:color w:val="273137"/>
+          <w:sz w:val="19"/>
+        </w:rPr>
+        <w:t xml:space="preserve"> or human escalation path, then cost measured production usage.</w:t>
       </w:r>
     </w:p>
     <w:p>
@@ -6756,6 +6820,48 @@
             <w:color w:val="2F7868"/>
             <w:u w:val="single"/>
           </w:rPr>
+          <w:t>OpenAI gpt-5.6-luna model</w:t>
+        </w:r>
+      </w:hyperlink>
+    </w:p>
+    <w:p>
+      <w:pPr>
+        <w:ind w:left="312" w:hanging="142"/>
+      </w:pPr>
+      <w:r>
+        <w:rPr>
+          <w:rFonts w:ascii="Arial" w:hAnsi="Arial"/>
+          <w:color w:val="2F7868"/>
+        </w:rPr>
+        <w:t xml:space="preserve">•  </w:t>
+      </w:r>
+      <w:hyperlink r:id="rId20">
+        <w:r>
+          <w:rPr>
+            <w:color w:val="2F7868"/>
+            <w:u w:val="single"/>
+          </w:rPr>
+          <w:t>OpenAI API pricing</w:t>
+        </w:r>
+      </w:hyperlink>
+    </w:p>
+    <w:p>
+      <w:pPr>
+        <w:ind w:left="312" w:hanging="142"/>
+      </w:pPr>
+      <w:r>
+        <w:rPr>
+          <w:rFonts w:ascii="Arial" w:hAnsi="Arial"/>
+          <w:color w:val="2F7868"/>
+        </w:rPr>
+        <w:t xml:space="preserve">•  </w:t>
+      </w:r>
+      <w:hyperlink r:id="rId21">
+        <w:r>
+          <w:rPr>
+            <w:color w:val="2F7868"/>
+            <w:u w:val="single"/>
+          </w:rPr>
           <w:t>Qi Card gateway documentation</w:t>
         </w:r>
       </w:hyperlink>
@@ -6771,7 +6877,7 @@
         </w:rPr>
         <w:t xml:space="preserve">•  </w:t>
       </w:r>
-      <w:hyperlink r:id="rId20">
+      <w:hyperlink r:id="rId22">
         <w:r>
           <w:rPr>
             <w:color w:val="2F7868"/>
@@ -6792,7 +6898,7 @@
         </w:rPr>
         <w:t xml:space="preserve">•  </w:t>
       </w:r>
-      <w:hyperlink r:id="rId21">
+      <w:hyperlink r:id="rId23">
         <w:r>
           <w:rPr>
             <w:color w:val="2F7868"/>
@@ -6813,7 +6919,7 @@
         </w:rPr>
         <w:t xml:space="preserve">•  </w:t>
       </w:r>
-      <w:hyperlink r:id="rId22">
+      <w:hyperlink r:id="rId24">
         <w:r>
           <w:rPr>
             <w:color w:val="2F7868"/>
@@ -6834,7 +6940,7 @@
         </w:rPr>
         <w:t xml:space="preserve">•  </w:t>
       </w:r>
-      <w:hyperlink r:id="rId23">
+      <w:hyperlink r:id="rId25">
         <w:r>
           <w:rPr>
             <w:color w:val="2F7868"/>
@@ -6855,7 +6961,7 @@
         </w:rPr>
         <w:t xml:space="preserve">•  </w:t>
       </w:r>
-      <w:hyperlink r:id="rId24">
+      <w:hyperlink r:id="rId26">
         <w:r>
           <w:rPr>
             <w:color w:val="2F7868"/>

</xml_diff>

<commit_message>
Replace CodeRabbit with Graphite review-first CI
</commit_message>
<xml_diff>
--- a/docs/commercial/Muntajaa-Cost-Plan.docx
+++ b/docs/commercial/Muntajaa-Cost-Plan.docx
@@ -198,7 +198,7 @@
                 <w:color w:val="273137"/>
                 <w:sz w:val="20"/>
               </w:rPr>
-              <w:t>2 August 2026</w:t>
+              <w:t>18 August 2026</w:t>
             </w:r>
           </w:p>
         </w:tc>
@@ -533,7 +533,7 @@
                 <w:color w:val="273137"/>
                 <w:sz w:val="19"/>
               </w:rPr>
-              <w:t xml:space="preserve"> The £4,000 monthly figure is development and project management. The software-stack total is separate. Pound, dollar and Iraqi dinar amounts are kept separate rather than converted using a temporary exchange rate.</w:t>
+              <w:t xml:space="preserve"> The £4,000 monthly figure is development and project management. The software-stack total is separate and includes Graphite at its current cost of $0. Pound, dollar and Iraqi dinar amounts are kept separate rather than converted using a temporary exchange rate.</w:t>
             </w:r>
           </w:p>
         </w:tc>
@@ -782,7 +782,7 @@
                 <w:color w:val="273137"/>
                 <w:sz w:val="18"/>
               </w:rPr>
-              <w:t>$294/month</w:t>
+              <w:t>$234/month</w:t>
             </w:r>
           </w:p>
         </w:tc>
@@ -806,7 +806,7 @@
                 <w:color w:val="273137"/>
                 <w:sz w:val="18"/>
               </w:rPr>
-              <w:t>Cloudflare Workers, Supabase Pro, Codex, CodeRabbit Pro+ and one GitHub Team seat</w:t>
+              <w:t>Cloudflare Workers, Supabase Pro, Codex, Graphite at $0 and one GitHub Team seat</w:t>
             </w:r>
           </w:p>
         </w:tc>
@@ -860,7 +860,7 @@
                 <w:color w:val="273137"/>
                 <w:sz w:val="18"/>
               </w:rPr>
-              <w:t>$290/month</w:t>
+              <w:t>$230/month</w:t>
             </w:r>
           </w:p>
         </w:tc>
@@ -1824,7 +1824,7 @@
                 <w:color w:val="273137"/>
                 <w:sz w:val="18"/>
               </w:rPr>
-              <w:t>CodeRabbit Pro+</w:t>
+              <w:t>Graphite Team trial, then Hobby/free</w:t>
             </w:r>
           </w:p>
         </w:tc>
@@ -1849,7 +1849,7 @@
                 <w:color w:val="273137"/>
                 <w:sz w:val="18"/>
               </w:rPr>
-              <w:t>$60/month</w:t>
+              <w:t>$0 currently</w:t>
             </w:r>
           </w:p>
         </w:tc>
@@ -1873,7 +1873,7 @@
                 <w:color w:val="273137"/>
                 <w:sz w:val="18"/>
               </w:rPr>
-              <w:t>Confirmed</w:t>
+              <w:t>Confirmed current state</w:t>
             </w:r>
           </w:p>
         </w:tc>
@@ -1897,7 +1897,7 @@
                 <w:color w:val="273137"/>
                 <w:sz w:val="18"/>
               </w:rPr>
-              <w:t>Pro+ billed month-to-month for the initial trial</w:t>
+              <w:t>Billing shows Team, Trial, one billable user and "Select a plan"; no paid plan is selected. The trial ends 17 September 2026; continue on Hobby/free afterwards</w:t>
             </w:r>
           </w:p>
         </w:tc>
@@ -3896,7 +3896,7 @@
                 <w:color w:val="273137"/>
                 <w:sz w:val="18"/>
               </w:rPr>
-              <w:t>CodeRabbit Pro+</w:t>
+              <w:t>Graphite</w:t>
             </w:r>
           </w:p>
         </w:tc>
@@ -3921,7 +3921,7 @@
                 <w:color w:val="273137"/>
                 <w:sz w:val="18"/>
               </w:rPr>
-              <w:t>$60/month</w:t>
+              <w:t>$0 current annual cost</w:t>
             </w:r>
           </w:p>
         </w:tc>
@@ -3945,7 +3945,7 @@
                 <w:color w:val="273137"/>
                 <w:sz w:val="18"/>
               </w:rPr>
-              <w:t>Month-to-month</w:t>
+              <w:t>Current</w:t>
             </w:r>
           </w:p>
         </w:tc>
@@ -3969,7 +3969,7 @@
                 <w:color w:val="273137"/>
                 <w:sz w:val="18"/>
               </w:rPr>
-              <w:t>Selected for the initial trial; $720 if retained for 12 months</w:t>
+              <w:t>The Team trial is free and the intended post-trial plan is Hobby/free. Any paid upgrade is deferred/TBC and requires explicit owner approval</w:t>
             </w:r>
           </w:p>
         </w:tc>
@@ -6255,7 +6255,10 @@
         </w:pBdr>
       </w:pPr>
       <w:r>
-        <w:t>5. Decisions required before spending</w:t>
+        <w:rPr>
+          <w:spacing w:val="10"/>
+        </w:rPr>
+        <w:t xml:space="preserve">5. Decisions required before spending</w:t>
       </w:r>
     </w:p>
     <w:p>
@@ -6281,7 +6284,7 @@
           <w:color w:val="273137"/>
           <w:sz w:val="19"/>
         </w:rPr>
-        <w:t xml:space="preserve">2. Approve the final </w:t>
+        <w:t>2. Use the current Graphite Team trial until 17 September 2026, then continue on Hobby/free. Any paid upgrade is deferred/TBC and requires explicit owner approval.</w:t>
       </w:r>
       <w:r>
         <w:rPr>
@@ -6289,6 +6292,35 @@
           <w:color w:val="273137"/>
           <w:sz w:val="18"/>
         </w:rPr>
+        <w:t/>
+      </w:r>
+      <w:r>
+        <w:rPr>
+          <w:rFonts w:ascii="Arial" w:hAnsi="Arial"/>
+          <w:color w:val="273137"/>
+          <w:sz w:val="19"/>
+        </w:rPr>
+        <w:t xml:space="preserve"/>
+      </w:r>
+    </w:p>
+    <w:p>
+      <w:pPr>
+        <w:ind w:left="312" w:hanging="142"/>
+      </w:pPr>
+      <w:r>
+        <w:rPr>
+          <w:rFonts w:ascii="Arial" w:hAnsi="Arial"/>
+          <w:color w:val="273137"/>
+          <w:sz w:val="19"/>
+        </w:rPr>
+        <w:t xml:space="preserve">3. Approve the final </w:t>
+      </w:r>
+      <w:r>
+        <w:rPr>
+          <w:rFonts w:ascii="Courier New" w:hAnsi="Courier New"/>
+          <w:color w:val="273137"/>
+          <w:sz w:val="18"/>
+        </w:rPr>
         <w:t>muntajaa.com</w:t>
       </w:r>
       <w:r>
@@ -6310,7 +6342,7 @@
           <w:color w:val="273137"/>
           <w:sz w:val="19"/>
         </w:rPr>
-        <w:t>3. Select the Iraqi company registry after local legal and accounting advice.</w:t>
+        <w:t>4. Select the Iraqi company registry after local legal and accounting advice.</w:t>
       </w:r>
     </w:p>
     <w:p>
@@ -6323,7 +6355,7 @@
           <w:color w:val="273137"/>
           <w:sz w:val="19"/>
         </w:rPr>
-        <w:t>4. Validate Qi Card first and compare its written offer with ZainCash and AsiaPay.</w:t>
+        <w:t>5. Validate Qi Card first and compare its written offer with ZainCash and AsiaPay.</w:t>
       </w:r>
     </w:p>
     <w:p>
@@ -6336,7 +6368,7 @@
           <w:color w:val="273137"/>
           <w:sz w:val="19"/>
         </w:rPr>
-        <w:t>5. Obtain legal approval of the owner-document checklist and retention schedule before storage goes live.</w:t>
+        <w:t>6. Obtain legal approval of the owner-document checklist and retention schedule before storage goes live.</w:t>
       </w:r>
     </w:p>
     <w:p>
@@ -6349,7 +6381,7 @@
           <w:color w:val="273137"/>
           <w:sz w:val="19"/>
         </w:rPr>
-        <w:t xml:space="preserve">6. Quality-test </w:t>
+        <w:t xml:space="preserve">7. Quality-test </w:t>
       </w:r>
       <w:r>
         <w:rPr>
@@ -6394,7 +6426,7 @@
           <w:color w:val="273137"/>
           <w:sz w:val="19"/>
         </w:rPr>
-        <w:t>7. Obtain the remaining TBC quotations and then calculate the 10% one-off contingency.</w:t>
+        <w:t>8. Obtain the remaining TBC quotations and then calculate the 10% one-off contingency.</w:t>
       </w:r>
     </w:p>
     <w:p>
@@ -6407,7 +6439,7 @@
           <w:color w:val="273137"/>
           <w:sz w:val="19"/>
         </w:rPr>
-        <w:t>8. Approve Phase 2 timing before opening app-store organisation accounts.</w:t>
+        <w:t>9. Approve Phase 2 timing before opening app-store organisation accounts.</w:t>
       </w:r>
     </w:p>
     <w:p>
@@ -6419,7 +6451,7 @@
         </w:pBdr>
       </w:pPr>
       <w:r>
-        <w:t>6. Budget acknowledgement</w:t>
+        <w:t xml:space="preserve">6. Budget acknowledgement</w:t>
       </w:r>
     </w:p>
     <w:p>
@@ -6601,6 +6633,9 @@
         </w:pBdr>
       </w:pPr>
       <w:r>
+        <w:rPr>
+          <w:spacing w:val="10"/>
+        </w:rPr>
         <w:t>7. Pricing and research basis</w:t>
       </w:r>
     </w:p>
@@ -6611,7 +6646,7 @@
           <w:color w:val="273137"/>
           <w:sz w:val="21"/>
         </w:rPr>
-        <w:t>Public prices and provider evidence were checked during the July and 2 August 2026 research sessions. Supplier prices can change and final invoices may include tax, currency conversion or card charges.</w:t>
+        <w:t>Public prices and provider evidence were checked during the July, 2 August and 18 August 2026 research sessions. The Graphite cost uses the live Billing UI state observed on 18 August 2026: Team, Trial, one billable user, "Select a plan", trial ending 17 September 2026 and no paid plan selected. Supplier prices can change and final invoices may include tax, currency conversion or card charges.</w:t>
       </w:r>
     </w:p>
     <w:p>
@@ -6652,7 +6687,7 @@
             <w:color w:val="2F7868"/>
             <w:u w:val="single"/>
           </w:rPr>
-          <w:t>CodeRabbit plans</w:t>
+          <w:t>Graphite pricing</w:t>
         </w:r>
       </w:hyperlink>
     </w:p>

</xml_diff>